<commit_message>
permütasyon şifreleme algoritması eklendi
</commit_message>
<xml_diff>
--- a/BYM468_Helin_Özalkan_220609024_RAPOR3.docx
+++ b/BYM468_Helin_Özalkan_220609024_RAPOR3.docx
@@ -342,77 +342,27 @@
       </w:r>
       <w:proofErr w:type="gramEnd"/>
       <w:r>
-        <w:t xml:space="preserve"> Kriptografi dersi kapsamında verilen "Uygulama Ödevi 3" isterlerini karşılamak amacıyla, daha önce Sezar ve Doğrusal Şifreleme algoritmalarını içeren web uygulamasına yeni bir modül olarak eklenmiştir. Projenin temel amacı, </w:t>
-      </w:r>
-      <w:proofErr w:type="spellStart"/>
-      <w:r>
-        <w:t>polialfabetik</w:t>
-      </w:r>
-      <w:proofErr w:type="spellEnd"/>
-      <w:r>
-        <w:t xml:space="preserve"> bir şifreleme tekniği olan </w:t>
-      </w:r>
-      <w:proofErr w:type="spellStart"/>
-      <w:r>
-        <w:rPr>
-          <w:b/>
-          <w:bCs/>
-        </w:rPr>
-        <w:t>Vigenere</w:t>
-      </w:r>
-      <w:proofErr w:type="spellEnd"/>
-      <w:r>
-        <w:rPr>
-          <w:b/>
-          <w:bCs/>
-        </w:rPr>
-        <w:t xml:space="preserve"> Şifreleme </w:t>
-      </w:r>
-      <w:proofErr w:type="spellStart"/>
-      <w:r>
-        <w:rPr>
-          <w:b/>
-          <w:bCs/>
-        </w:rPr>
-        <w:t>Algoritması</w:t>
-      </w:r>
-      <w:r>
-        <w:t>'nı</w:t>
-      </w:r>
-      <w:proofErr w:type="spellEnd"/>
-      <w:r>
-        <w:t xml:space="preserve"> ve anahtar uzunluğunu tahmin etmeye yönelik </w:t>
-      </w:r>
-      <w:proofErr w:type="spellStart"/>
-      <w:r>
-        <w:rPr>
-          <w:b/>
-          <w:bCs/>
-        </w:rPr>
-        <w:t>Kasiski</w:t>
-      </w:r>
-      <w:proofErr w:type="spellEnd"/>
-      <w:r>
-        <w:rPr>
-          <w:b/>
-          <w:bCs/>
-        </w:rPr>
-        <w:t xml:space="preserve"> </w:t>
-      </w:r>
-      <w:proofErr w:type="spellStart"/>
-      <w:r>
-        <w:rPr>
-          <w:b/>
-          <w:bCs/>
-        </w:rPr>
-        <w:t>Testi</w:t>
-      </w:r>
-      <w:r>
-        <w:t>'ni</w:t>
-      </w:r>
-      <w:proofErr w:type="spellEnd"/>
-      <w:r>
-        <w:t xml:space="preserve"> modern ve interaktif bir web arayüzü üzerinde sunmaktır.</w:t>
+        <w:t xml:space="preserve"> Kriptografi dersi kapsamında verilen "Uygulama Ödevi 3" isterlerini karşılamak amacıyla, daha önce Sezar ve Doğrusal Şifreleme algoritmalarını içeren web uygulamasına yeni bir modül olarak eklenmiştir. Projenin temel amacı, polialfabetik bir şifreleme tekniği olan </w:t>
+      </w:r>
+      <w:r>
+        <w:rPr>
+          <w:b/>
+          <w:bCs/>
+        </w:rPr>
+        <w:t>Vigenere Şifreleme Algoritması</w:t>
+      </w:r>
+      <w:r>
+        <w:t xml:space="preserve">'nı ve anahtar uzunluğunu tahmin etmeye yönelik </w:t>
+      </w:r>
+      <w:r>
+        <w:rPr>
+          <w:b/>
+          <w:bCs/>
+        </w:rPr>
+        <w:t>Kasiski Testi</w:t>
+      </w:r>
+      <w:r>
+        <w:t>'ni modern ve interaktif bir web arayüzü üzerinde sunmaktır.</w:t>
       </w:r>
     </w:p>
     <w:p>
@@ -435,57 +385,17 @@
         <w:t>Şifreleme:</w:t>
       </w:r>
       <w:r>
-        <w:t xml:space="preserve"> Kullanıcı tarafından girilen bir düz metni (</w:t>
-      </w:r>
-      <w:proofErr w:type="spellStart"/>
-      <w:r>
-        <w:t>plain</w:t>
-      </w:r>
-      <w:proofErr w:type="spellEnd"/>
-      <w:r>
-        <w:t xml:space="preserve"> </w:t>
-      </w:r>
-      <w:proofErr w:type="spellStart"/>
-      <w:r>
-        <w:t>text</w:t>
-      </w:r>
-      <w:proofErr w:type="spellEnd"/>
-      <w:r>
-        <w:t xml:space="preserve">), yine kullanıcı tarafından belirtilen bir </w:t>
-      </w:r>
-      <w:r>
-        <w:rPr>
-          <w:b/>
-          <w:bCs/>
-        </w:rPr>
-        <w:t>anahtar kelime (</w:t>
-      </w:r>
-      <w:proofErr w:type="spellStart"/>
-      <w:r>
-        <w:rPr>
-          <w:b/>
-          <w:bCs/>
-        </w:rPr>
-        <w:t>keyword</w:t>
-      </w:r>
-      <w:proofErr w:type="spellEnd"/>
-      <w:r>
-        <w:rPr>
-          <w:b/>
-          <w:bCs/>
-        </w:rPr>
-        <w:t>)</w:t>
-      </w:r>
-      <w:r>
-        <w:t xml:space="preserve"> kullanarak </w:t>
-      </w:r>
-      <w:proofErr w:type="spellStart"/>
-      <w:r>
-        <w:t>Vigenere</w:t>
-      </w:r>
-      <w:proofErr w:type="spellEnd"/>
-      <w:r>
-        <w:t xml:space="preserve"> algoritması ile şifrelemek. Bu aşamada anahtar kelimenin geçerliliği (sadece harflerden oluşması) kontrol edilmektedir.</w:t>
+        <w:t xml:space="preserve"> Kullanıcı tarafından girilen bir düz metni (plain text), yine kullanıcı tarafından belirtilen bir </w:t>
+      </w:r>
+      <w:r>
+        <w:rPr>
+          <w:b/>
+          <w:bCs/>
+        </w:rPr>
+        <w:t>anahtar kelime (keyword)</w:t>
+      </w:r>
+      <w:r>
+        <w:t xml:space="preserve"> kullanarak Vigenere algoritması ile şifrelemek. Bu aşamada anahtar kelimenin geçerliliği (sadece harflerden oluşması) kontrol edilmektedir.</w:t>
       </w:r>
     </w:p>
     <w:p>
@@ -503,23 +413,7 @@
         <w:t>De-Şifreleme:</w:t>
       </w:r>
       <w:r>
-        <w:t xml:space="preserve"> Şifrelenmiş bir metni (</w:t>
-      </w:r>
-      <w:proofErr w:type="spellStart"/>
-      <w:r>
-        <w:t>cipher</w:t>
-      </w:r>
-      <w:proofErr w:type="spellEnd"/>
-      <w:r>
-        <w:t xml:space="preserve"> </w:t>
-      </w:r>
-      <w:proofErr w:type="spellStart"/>
-      <w:r>
-        <w:t>text</w:t>
-      </w:r>
-      <w:proofErr w:type="spellEnd"/>
-      <w:r>
-        <w:t>) ve bu metni şifrelerken kullanılan anahtar kelimeyi alarak orijinal düz metne geri dönüştürmek.</w:t>
+        <w:t xml:space="preserve"> Şifrelenmiş bir metni (cipher text) ve bu metni şifrelerken kullanılan anahtar kelimeyi alarak orijinal düz metne geri dönüştürmek.</w:t>
       </w:r>
     </w:p>
     <w:p>
@@ -534,34 +428,10 @@
           <w:b/>
           <w:bCs/>
         </w:rPr>
-        <w:t>Anahtar Uzunluğu Tahmini (</w:t>
-      </w:r>
-      <w:proofErr w:type="spellStart"/>
-      <w:r>
-        <w:rPr>
-          <w:b/>
-          <w:bCs/>
-        </w:rPr>
-        <w:t>Kasiski</w:t>
-      </w:r>
-      <w:proofErr w:type="spellEnd"/>
-      <w:r>
-        <w:rPr>
-          <w:b/>
-          <w:bCs/>
-        </w:rPr>
-        <w:t xml:space="preserve"> Testi):</w:t>
-      </w:r>
-      <w:r>
-        <w:t xml:space="preserve"> Anahtar kelimesi bilinmeyen bir şifreli metin üzerinde </w:t>
-      </w:r>
-      <w:proofErr w:type="spellStart"/>
-      <w:r>
-        <w:t>Kasiski</w:t>
-      </w:r>
-      <w:proofErr w:type="spellEnd"/>
-      <w:r>
-        <w:t xml:space="preserve"> testini uygulayarak, metin içindeki tekrarlayan dizilerin mesafelerinin ortak bölenlerini analiz etmek ve en sık tekrar eden böleni </w:t>
+        <w:t>Anahtar Uzunluğu Tahmini (Kasiski Testi):</w:t>
+      </w:r>
+      <w:r>
+        <w:t xml:space="preserve"> Anahtar kelimesi bilinmeyen bir şifreli metin üzerinde Kasiski testini uygulayarak, metin içindeki tekrarlayan dizilerin mesafelerinin ortak bölenlerini analiz etmek ve en sık tekrar eden böleni </w:t>
       </w:r>
       <w:r>
         <w:rPr>
@@ -616,15 +486,7 @@
         <w:t>HTML5:</w:t>
       </w:r>
       <w:r>
-        <w:t xml:space="preserve"> Uygulamanın temel yapısı, karşılama ekranı ve </w:t>
-      </w:r>
-      <w:proofErr w:type="spellStart"/>
-      <w:r>
-        <w:t>Vigenere</w:t>
-      </w:r>
-      <w:proofErr w:type="spellEnd"/>
-      <w:r>
-        <w:t xml:space="preserve"> modülünün arayüzünü oluşturmak için kullanılmıştır.</w:t>
+        <w:t xml:space="preserve"> Uygulamanın temel yapısı, karşılama ekranı ve Vigenere modülünün arayüzünü oluşturmak için kullanılmıştır.</w:t>
       </w:r>
     </w:p>
     <w:p>
@@ -642,15 +504,7 @@
         <w:t>CSS3:</w:t>
       </w:r>
       <w:r>
-        <w:t xml:space="preserve"> Uygulama genelinde tutarlı bir görünüm sağlamak amacıyla ortak stil dosyası (style.css) kullanılmıştır. </w:t>
-      </w:r>
-      <w:proofErr w:type="spellStart"/>
-      <w:r>
-        <w:t>Vigenere</w:t>
-      </w:r>
-      <w:proofErr w:type="spellEnd"/>
-      <w:r>
-        <w:t xml:space="preserve"> modülüne özel arayüz elemanları için gerekli stiller eklenmiştir.</w:t>
+        <w:t xml:space="preserve"> Uygulama genelinde tutarlı bir görünüm sağlamak amacıyla ortak stil dosyası (style.css) kullanılmıştır. Vigenere modülüne özel arayüz elemanları için gerekli stiller eklenmiştir.</w:t>
       </w:r>
     </w:p>
     <w:p>
@@ -665,34 +519,10 @@
           <w:b/>
           <w:bCs/>
         </w:rPr>
-        <w:t>JavaScript (</w:t>
-      </w:r>
-      <w:proofErr w:type="spellStart"/>
-      <w:r>
-        <w:rPr>
-          <w:b/>
-          <w:bCs/>
-        </w:rPr>
-        <w:t>Vanilla</w:t>
-      </w:r>
-      <w:proofErr w:type="spellEnd"/>
-      <w:r>
-        <w:rPr>
-          <w:b/>
-          <w:bCs/>
-        </w:rPr>
-        <w:t xml:space="preserve"> JS):</w:t>
-      </w:r>
-      <w:r>
-        <w:t xml:space="preserve"> </w:t>
-      </w:r>
-      <w:proofErr w:type="spellStart"/>
-      <w:r>
-        <w:t>Vigenere</w:t>
-      </w:r>
-      <w:proofErr w:type="spellEnd"/>
-      <w:r>
-        <w:t xml:space="preserve"> algoritmasının (</w:t>
+        <w:t>JavaScript (Vanilla JS):</w:t>
+      </w:r>
+      <w:r>
+        <w:t xml:space="preserve"> Vigenere algoritmasının (</w:t>
       </w:r>
       <w:proofErr w:type="gramStart"/>
       <w:r>
@@ -700,15 +530,7 @@
       </w:r>
       <w:proofErr w:type="gramEnd"/>
       <w:r>
-        <w:t xml:space="preserve"> de-şifreleme), anahtar kelime doğrulama mantığının ve </w:t>
-      </w:r>
-      <w:proofErr w:type="spellStart"/>
-      <w:r>
-        <w:t>Kasiski</w:t>
-      </w:r>
-      <w:proofErr w:type="spellEnd"/>
-      <w:r>
-        <w:t xml:space="preserve"> testinin (tekrarlayan dizi bulma, mesafe hesaplama, bölen analizi) tüm işlevleri saf JavaScript ile kodlanmıştır.</w:t>
+        <w:t xml:space="preserve"> de-şifreleme), anahtar kelime doğrulama mantığının ve Kasiski testinin (tekrarlayan dizi bulma, mesafe hesaplama, bölen analizi) tüm işlevleri saf JavaScript ile kodlanmıştır.</w:t>
       </w:r>
     </w:p>
     <w:p/>
@@ -730,15 +552,7 @@
     </w:p>
     <w:p>
       <w:r>
-        <w:t xml:space="preserve">Uygulama, üç farklı kriptografi ödevini (Sezar, Doğrusal, </w:t>
-      </w:r>
-      <w:proofErr w:type="spellStart"/>
-      <w:r>
-        <w:t>Vigenere</w:t>
-      </w:r>
-      <w:proofErr w:type="spellEnd"/>
-      <w:r>
-        <w:t xml:space="preserve">) tek bir çatı altında toplayan </w:t>
+        <w:t xml:space="preserve">Uygulama, üç farklı kriptografi ödevini (Sezar, Doğrusal, Vigenere) tek bir çatı altında toplayan </w:t>
       </w:r>
       <w:r>
         <w:rPr>
@@ -762,36 +576,15 @@
         <w:t>karşılama ekranı</w:t>
       </w:r>
       <w:r>
-        <w:t xml:space="preserve"> ile karşılaşır (Şekil 1). Bu merkezi giriş noktası, her bir algoritma modülünün ayrı klasörlerde (/</w:t>
-      </w:r>
-      <w:proofErr w:type="spellStart"/>
-      <w:r>
-        <w:t>sezar</w:t>
-      </w:r>
-      <w:proofErr w:type="spellEnd"/>
-      <w:r>
-        <w:t>, /</w:t>
-      </w:r>
-      <w:proofErr w:type="spellStart"/>
-      <w:r>
-        <w:t>dogrusal</w:t>
-      </w:r>
-      <w:proofErr w:type="spellEnd"/>
-      <w:r>
-        <w:t>, /</w:t>
-      </w:r>
-      <w:proofErr w:type="spellStart"/>
-      <w:r>
-        <w:t>vigenere</w:t>
-      </w:r>
-      <w:proofErr w:type="spellEnd"/>
-      <w:r>
-        <w:t>) düzenlenmesine olanak tanır ve gelecekte yeni algoritmaların sisteme kolayca entegre edilebilmesini sağlar.</w:t>
+        <w:t xml:space="preserve"> ile karşılaşır (Şekil 1). Bu merkezi giriş noktası, her bir algoritma modülünün ayrı klasörlerde (/sezar, /dogrusal, /vigenere) düzenlenmesine olanak tanır ve gelecekte yeni algoritmaların sisteme kolayca entegre edilebilmesini sağlar.</w:t>
       </w:r>
     </w:p>
     <w:p/>
     <w:p>
       <w:r>
+        <w:rPr>
+          <w:noProof/>
+        </w:rPr>
         <w:drawing>
           <wp:inline distT="0" distB="0" distL="0" distR="0" wp14:anchorId="0FE69237" wp14:editId="5266EBAE">
             <wp:extent cx="5760720" cy="2879090"/>
@@ -838,37 +631,13 @@
           <w:b/>
           <w:bCs/>
         </w:rPr>
-        <w:t xml:space="preserve">Şekil 1: Kullanıcıyı karşılayan ve Sezar, Doğrusal veya </w:t>
-      </w:r>
-      <w:proofErr w:type="spellStart"/>
-      <w:r>
-        <w:rPr>
-          <w:b/>
-          <w:bCs/>
-        </w:rPr>
-        <w:t>Vigenere</w:t>
-      </w:r>
-      <w:proofErr w:type="spellEnd"/>
-      <w:r>
-        <w:rPr>
-          <w:b/>
-          <w:bCs/>
-        </w:rPr>
-        <w:t xml:space="preserve"> algoritma modülünü seçmesini sağlayan ana giriş sayfası.</w:t>
+        <w:t>Şekil 1: Kullanıcıyı karşılayan ve Sezar, Doğrusal veya Vigenere algoritma modülünü seçmesini sağlayan ana giriş sayfası.</w:t>
       </w:r>
     </w:p>
     <w:p/>
     <w:p>
       <w:r>
-        <w:t>Kullanıcı "</w:t>
-      </w:r>
-      <w:proofErr w:type="spellStart"/>
-      <w:r>
-        <w:t>Vigenere</w:t>
-      </w:r>
-      <w:proofErr w:type="spellEnd"/>
-      <w:r>
-        <w:t xml:space="preserve"> Şifreleme" seçeneğini seçtiğinde, yeni ödevin isterlerine uygun olarak üç sekmeli bir arayüze yönlendirilir: </w:t>
+        <w:t xml:space="preserve">Kullanıcı "Vigenere Şifreleme" seçeneğini seçtiğinde, yeni ödevin isterlerine uygun olarak üç sekmeli bir arayüze yönlendirilir: </w:t>
       </w:r>
       <w:proofErr w:type="gramStart"/>
       <w:r>
@@ -898,15 +667,7 @@
     </w:p>
     <w:p>
       <w:r>
-        <w:t xml:space="preserve">Bu bölüm, </w:t>
-      </w:r>
-      <w:proofErr w:type="spellStart"/>
-      <w:r>
-        <w:t>Vigenere</w:t>
-      </w:r>
-      <w:proofErr w:type="spellEnd"/>
-      <w:r>
-        <w:t xml:space="preserve"> algoritması ile metin şifreler.</w:t>
+        <w:t>Bu bölüm, Vigenere algoritması ile metin şifreler.</w:t>
       </w:r>
     </w:p>
     <w:p>
@@ -954,6 +715,9 @@
         <w:jc w:val="center"/>
       </w:pPr>
       <w:r>
+        <w:rPr>
+          <w:noProof/>
+        </w:rPr>
         <w:lastRenderedPageBreak/>
         <w:drawing>
           <wp:inline distT="0" distB="0" distL="0" distR="0" wp14:anchorId="27F1BC7B" wp14:editId="6671928A">
@@ -1019,23 +783,7 @@
           <w:b/>
           <w:bCs/>
         </w:rPr>
-        <w:t xml:space="preserve">: </w:t>
-      </w:r>
-      <w:proofErr w:type="spellStart"/>
-      <w:r>
-        <w:rPr>
-          <w:b/>
-          <w:bCs/>
-        </w:rPr>
-        <w:t>Vigenere</w:t>
-      </w:r>
-      <w:proofErr w:type="spellEnd"/>
-      <w:r>
-        <w:rPr>
-          <w:b/>
-          <w:bCs/>
-        </w:rPr>
-        <w:t xml:space="preserve"> Şifreleme arayüzü ve anahtar kelime için anlık hata kontrolü.</w:t>
+        <w:t>: Vigenere Şifreleme arayüzü ve anahtar kelime için anlık hata kontrolü.</w:t>
       </w:r>
     </w:p>
     <w:p>
@@ -1094,6 +842,9 @@
         <w:jc w:val="center"/>
       </w:pPr>
       <w:r>
+        <w:rPr>
+          <w:noProof/>
+        </w:rPr>
         <w:drawing>
           <wp:inline distT="0" distB="0" distL="0" distR="0" wp14:anchorId="7FADA761" wp14:editId="3C2DC139">
             <wp:extent cx="5760720" cy="2871470"/>
@@ -1193,15 +944,7 @@
     </w:p>
     <w:p>
       <w:r>
-        <w:t xml:space="preserve">Bu bölüm, ödev tanımında istenen </w:t>
-      </w:r>
-      <w:proofErr w:type="spellStart"/>
-      <w:r>
-        <w:t>Kasiski</w:t>
-      </w:r>
-      <w:proofErr w:type="spellEnd"/>
-      <w:r>
-        <w:t xml:space="preserve"> testini uygular.</w:t>
+        <w:t>Bu bölüm, ödev tanımında istenen Kasiski testini uygular.</w:t>
       </w:r>
     </w:p>
     <w:p>
@@ -1286,6 +1029,9 @@
         <w:jc w:val="center"/>
       </w:pPr>
       <w:r>
+        <w:rPr>
+          <w:noProof/>
+        </w:rPr>
         <w:drawing>
           <wp:inline distT="0" distB="0" distL="0" distR="0" wp14:anchorId="3ED04520" wp14:editId="63E74DF3">
             <wp:extent cx="5760720" cy="2879090"/>
@@ -1346,23 +1092,7 @@
           <w:b/>
           <w:bCs/>
         </w:rPr>
-        <w:t xml:space="preserve">: </w:t>
-      </w:r>
-      <w:proofErr w:type="spellStart"/>
-      <w:r>
-        <w:rPr>
-          <w:b/>
-          <w:bCs/>
-        </w:rPr>
-        <w:t>Kasiski</w:t>
-      </w:r>
-      <w:proofErr w:type="spellEnd"/>
-      <w:r>
-        <w:rPr>
-          <w:b/>
-          <w:bCs/>
-        </w:rPr>
-        <w:t xml:space="preserve"> Testi sekmesinde, şifreli metin analizi sonrası bulunan mesafeler, bölenler ve tahmin edilen anahtar uzunluğu.</w:t>
+        <w:t>: Kasiski Testi sekmesinde, şifreli metin analizi sonrası bulunan mesafeler, bölenler ve tahmin edilen anahtar uzunluğu.</w:t>
       </w:r>
     </w:p>
     <w:p/>
@@ -1426,229 +1156,23 @@
           <w:i/>
           <w:iCs/>
         </w:rPr>
-        <w:t>“</w:t>
-      </w:r>
+        <w:t xml:space="preserve">“bu uzun metin kasiski testinin dogru calisip calismadigini gormek icin hazirlandi tekrarlayan bolumler anahtar uzunlugunu bulmaya yardimci olacaktir baska bir tekrarlayan </w:t>
+      </w:r>
+      <w:proofErr w:type="gramStart"/>
       <w:r>
         <w:rPr>
           <w:i/>
           <w:iCs/>
         </w:rPr>
-        <w:t xml:space="preserve">bu uzun metin </w:t>
-      </w:r>
-      <w:proofErr w:type="spellStart"/>
+        <w:t>bolum</w:t>
+      </w:r>
+      <w:proofErr w:type="gramEnd"/>
       <w:r>
         <w:rPr>
           <w:i/>
           <w:iCs/>
         </w:rPr>
-        <w:t>kasiski</w:t>
-      </w:r>
-      <w:proofErr w:type="spellEnd"/>
-      <w:r>
-        <w:rPr>
-          <w:i/>
-          <w:iCs/>
-        </w:rPr>
-        <w:t xml:space="preserve"> testinin </w:t>
-      </w:r>
-      <w:proofErr w:type="spellStart"/>
-      <w:r>
-        <w:rPr>
-          <w:i/>
-          <w:iCs/>
-        </w:rPr>
-        <w:t>dogru</w:t>
-      </w:r>
-      <w:proofErr w:type="spellEnd"/>
-      <w:r>
-        <w:rPr>
-          <w:i/>
-          <w:iCs/>
-        </w:rPr>
-        <w:t xml:space="preserve"> </w:t>
-      </w:r>
-      <w:proofErr w:type="spellStart"/>
-      <w:r>
-        <w:rPr>
-          <w:i/>
-          <w:iCs/>
-        </w:rPr>
-        <w:t>calisip</w:t>
-      </w:r>
-      <w:proofErr w:type="spellEnd"/>
-      <w:r>
-        <w:rPr>
-          <w:i/>
-          <w:iCs/>
-        </w:rPr>
-        <w:t xml:space="preserve"> </w:t>
-      </w:r>
-      <w:proofErr w:type="spellStart"/>
-      <w:r>
-        <w:rPr>
-          <w:i/>
-          <w:iCs/>
-        </w:rPr>
-        <w:t>calismadigini</w:t>
-      </w:r>
-      <w:proofErr w:type="spellEnd"/>
-      <w:r>
-        <w:rPr>
-          <w:i/>
-          <w:iCs/>
-        </w:rPr>
-        <w:t xml:space="preserve"> </w:t>
-      </w:r>
-      <w:proofErr w:type="spellStart"/>
-      <w:r>
-        <w:rPr>
-          <w:i/>
-          <w:iCs/>
-        </w:rPr>
-        <w:t>gormek</w:t>
-      </w:r>
-      <w:proofErr w:type="spellEnd"/>
-      <w:r>
-        <w:rPr>
-          <w:i/>
-          <w:iCs/>
-        </w:rPr>
-        <w:t xml:space="preserve"> </w:t>
-      </w:r>
-      <w:proofErr w:type="spellStart"/>
-      <w:r>
-        <w:rPr>
-          <w:i/>
-          <w:iCs/>
-        </w:rPr>
-        <w:t>icin</w:t>
-      </w:r>
-      <w:proofErr w:type="spellEnd"/>
-      <w:r>
-        <w:rPr>
-          <w:i/>
-          <w:iCs/>
-        </w:rPr>
-        <w:t xml:space="preserve"> </w:t>
-      </w:r>
-      <w:proofErr w:type="spellStart"/>
-      <w:r>
-        <w:rPr>
-          <w:i/>
-          <w:iCs/>
-        </w:rPr>
-        <w:t>hazirlandi</w:t>
-      </w:r>
-      <w:proofErr w:type="spellEnd"/>
-      <w:r>
-        <w:rPr>
-          <w:i/>
-          <w:iCs/>
-        </w:rPr>
-        <w:t xml:space="preserve"> tekrarlayan </w:t>
-      </w:r>
-      <w:proofErr w:type="spellStart"/>
-      <w:r>
-        <w:rPr>
-          <w:i/>
-          <w:iCs/>
-        </w:rPr>
-        <w:t>bolumler</w:t>
-      </w:r>
-      <w:proofErr w:type="spellEnd"/>
-      <w:r>
-        <w:rPr>
-          <w:i/>
-          <w:iCs/>
-        </w:rPr>
-        <w:t xml:space="preserve"> anahtar </w:t>
-      </w:r>
-      <w:proofErr w:type="spellStart"/>
-      <w:r>
-        <w:rPr>
-          <w:i/>
-          <w:iCs/>
-        </w:rPr>
-        <w:t>uzunlugunu</w:t>
-      </w:r>
-      <w:proofErr w:type="spellEnd"/>
-      <w:r>
-        <w:rPr>
-          <w:i/>
-          <w:iCs/>
-        </w:rPr>
-        <w:t xml:space="preserve"> bulmaya </w:t>
-      </w:r>
-      <w:proofErr w:type="spellStart"/>
-      <w:r>
-        <w:rPr>
-          <w:i/>
-          <w:iCs/>
-        </w:rPr>
-        <w:t>yardimci</w:t>
-      </w:r>
-      <w:proofErr w:type="spellEnd"/>
-      <w:r>
-        <w:rPr>
-          <w:i/>
-          <w:iCs/>
-        </w:rPr>
-        <w:t xml:space="preserve"> </w:t>
-      </w:r>
-      <w:proofErr w:type="spellStart"/>
-      <w:r>
-        <w:rPr>
-          <w:i/>
-          <w:iCs/>
-        </w:rPr>
-        <w:t>olacaktir</w:t>
-      </w:r>
-      <w:proofErr w:type="spellEnd"/>
-      <w:r>
-        <w:rPr>
-          <w:i/>
-          <w:iCs/>
-        </w:rPr>
-        <w:t xml:space="preserve"> </w:t>
-      </w:r>
-      <w:proofErr w:type="spellStart"/>
-      <w:r>
-        <w:rPr>
-          <w:i/>
-          <w:iCs/>
-        </w:rPr>
-        <w:t>baska</w:t>
-      </w:r>
-      <w:proofErr w:type="spellEnd"/>
-      <w:r>
-        <w:rPr>
-          <w:i/>
-          <w:iCs/>
-        </w:rPr>
-        <w:t xml:space="preserve"> bir tekrarlayan </w:t>
-      </w:r>
-      <w:proofErr w:type="gramStart"/>
-      <w:r>
-        <w:rPr>
-          <w:i/>
-          <w:iCs/>
-        </w:rPr>
-        <w:t>bolum</w:t>
-      </w:r>
-      <w:proofErr w:type="gramEnd"/>
-      <w:r>
-        <w:rPr>
-          <w:i/>
-          <w:iCs/>
-        </w:rPr>
-        <w:t xml:space="preserve"> daha</w:t>
-      </w:r>
-      <w:r>
-        <w:rPr>
-          <w:i/>
-          <w:iCs/>
-        </w:rPr>
-        <w:t>”</w:t>
+        <w:t xml:space="preserve"> daha”</w:t>
       </w:r>
     </w:p>
     <w:p>
@@ -1673,21 +1197,7 @@
           <w:i/>
           <w:iCs/>
         </w:rPr>
-        <w:t>“</w:t>
-      </w:r>
-      <w:r>
-        <w:rPr>
-          <w:i/>
-          <w:iCs/>
-        </w:rPr>
-        <w:t>gizli (Uzunluk: 5)</w:t>
-      </w:r>
-      <w:r>
-        <w:rPr>
-          <w:i/>
-          <w:iCs/>
-        </w:rPr>
-        <w:t>”</w:t>
+        <w:t>“gizli (Uzunluk: 5)”</w:t>
       </w:r>
     </w:p>
     <w:p/>
@@ -1701,15 +1211,7 @@
     </w:p>
     <w:p>
       <w:r>
-        <w:t xml:space="preserve">İlgili metin ve anahtar kelime girilerek şifreleme işlemi yapılmıştır. Algoritma, Türkçe alfabeye göre </w:t>
-      </w:r>
-      <w:proofErr w:type="spellStart"/>
-      <w:r>
-        <w:t>Vigenere</w:t>
-      </w:r>
-      <w:proofErr w:type="spellEnd"/>
-      <w:r>
-        <w:t xml:space="preserve"> şifrelemesini uygulayarak aşağıdaki şifreli metni başarıyla üretmiştir.</w:t>
+        <w:t>İlgili metin ve anahtar kelime girilerek şifreleme işlemi yapılmıştır. Algoritma, Türkçe alfabeye göre Vigenere şifrelemesini uygulayarak aşağıdaki şifreli metni başarıyla üretmiştir.</w:t>
       </w:r>
     </w:p>
     <w:p>
@@ -1734,21 +1236,7 @@
           <w:i/>
           <w:iCs/>
         </w:rPr>
-        <w:t>“</w:t>
-      </w:r>
-      <w:r>
-        <w:rPr>
-          <w:i/>
-          <w:iCs/>
-        </w:rPr>
-        <w:t>ğftkftvdğştuzfşzuığnzeıbştmnscckzzşzşönisşraiişfüyöönevjuınştrzkşyüzbmöedycgcklhgyacücvkpcgyztegctkftütsftfahüşivlhgcçüvhşnzihijğşyjzfugjıeejuplcsivlyğzkhviiğl</w:t>
-      </w:r>
-      <w:r>
-        <w:rPr>
-          <w:i/>
-          <w:iCs/>
-        </w:rPr>
-        <w:t>”</w:t>
+        <w:t>“ğftkftvdğştuzfşzuığnzeıbştmnscckzzşzşönisşraiişfüyöönevjuınştrzkşyüzbmöedycgcklhgyacücvkpcgyztegctkftütsftfahüşivlhgcçüvhşnzihijğşyjzfugjıeejuplcsivlyğzkhviiğl”</w:t>
       </w:r>
     </w:p>
     <w:p/>
@@ -1834,7 +1322,7 @@
           <w:noProof/>
         </w:rPr>
         <w:drawing>
-          <wp:inline distT="0" distB="0" distL="0" distR="0" wp14:anchorId="299BD98D" wp14:editId="13969D3A">
+          <wp:inline distT="0" distB="0" distL="0" distR="0" wp14:anchorId="299BD98D" wp14:editId="6D281EC7">
             <wp:extent cx="5760720" cy="2861945"/>
             <wp:effectExtent l="0" t="0" r="0" b="0"/>
             <wp:docPr id="1807718493" name="Resim 1" descr="ekran görüntüsü, metin, yazılım, multimedya yazılımı içeren bir resim&#10;&#10;Yapay zeka tarafından oluşturulmuş içerik yanlış olabilir."/>
@@ -1913,15 +1401,7 @@
     </w:p>
     <w:p>
       <w:r>
-        <w:t xml:space="preserve">Bir önceki adımda elde edilen şifreli metin, aynı anahtar kelime (gizli) ile </w:t>
-      </w:r>
-      <w:proofErr w:type="spellStart"/>
-      <w:r>
-        <w:t>deşifrelenmiş</w:t>
-      </w:r>
-      <w:proofErr w:type="spellEnd"/>
-      <w:r>
-        <w:t xml:space="preserve"> ve orijinal metin (boşluksuz hali) başarıyla elde edilmiştir.</w:t>
+        <w:t>Bir önceki adımda elde edilen şifreli metin, aynı anahtar kelime (gizli) ile deşifrelenmiş ve orijinal metin (boşluksuz hali) başarıyla elde edilmiştir.</w:t>
       </w:r>
     </w:p>
     <w:p>
@@ -1947,14 +1427,7 @@
           <w:i/>
           <w:iCs/>
         </w:rPr>
-        <w:t>“</w:t>
-      </w:r>
-      <w:r>
-        <w:rPr>
-          <w:i/>
-          <w:iCs/>
-        </w:rPr>
-        <w:t>buuzunmetinkasiskitestinindogrucalisipcalismadiginigormekicinhazirlanditekrarlayanbolumleranahtaruzunlugunubulmayayardimciolacaktirbaskabirtekrarlayanbolumdaha</w:t>
+        <w:t>“buuzunmetinkasiskitestinindogrucalisipcalismadiginigormekicinhazirlanditekrarlayanbolumleranahtaruzunlugunubulmayayardimciolacaktirbaskabirtekrarlayanbolumdaha</w:t>
       </w:r>
       <w:r>
         <w:t>”</w:t>
@@ -2041,7 +1514,7 @@
           <w:noProof/>
         </w:rPr>
         <w:drawing>
-          <wp:inline distT="0" distB="0" distL="0" distR="0" wp14:anchorId="7993BB14" wp14:editId="1025C22B">
+          <wp:inline distT="0" distB="0" distL="0" distR="0" wp14:anchorId="7993BB14" wp14:editId="44A44642">
             <wp:extent cx="5760720" cy="2840990"/>
             <wp:effectExtent l="0" t="0" r="0" b="0"/>
             <wp:docPr id="899300327" name="Resim 3" descr="ekran görüntüsü, metin, yazılım, multimedya yazılımı içeren bir resim&#10;&#10;Yapay zeka tarafından oluşturulmuş içerik yanlış olabilir."/>
@@ -2117,15 +1590,7 @@
         <w:pStyle w:val="Balk3"/>
       </w:pPr>
       <w:r>
-        <w:t>Adım 3: Anahtar Uzunluğu Tahmini (</w:t>
-      </w:r>
-      <w:proofErr w:type="spellStart"/>
-      <w:r>
-        <w:t>Kasiski</w:t>
-      </w:r>
-      <w:proofErr w:type="spellEnd"/>
-      <w:r>
-        <w:t xml:space="preserve"> Testi)</w:t>
+        <w:t>Adım 3: Anahtar Uzunluğu Tahmini (Kasiski Testi)</w:t>
       </w:r>
     </w:p>
     <w:p>
@@ -2135,47 +1600,7 @@
         </w:tabs>
       </w:pPr>
       <w:r>
-        <w:t>Son adımda, Adım 1'de elde edilen şifreli metin, anahtarı bilinmiyormuş gibi "Anahtar Uzunluğu" sekmesine girilmiştir. Maksimum anahtar uzunluğu 15 olarak ayarlanmıştır. Algoritma, metindeki tekrarlayan dizileri (</w:t>
-      </w:r>
-      <w:proofErr w:type="spellStart"/>
-      <w:r>
-        <w:t>fnz</w:t>
-      </w:r>
-      <w:proofErr w:type="spellEnd"/>
-      <w:r>
-        <w:t xml:space="preserve">, </w:t>
-      </w:r>
-      <w:proofErr w:type="spellStart"/>
-      <w:r>
-        <w:t>şğh</w:t>
-      </w:r>
-      <w:proofErr w:type="spellEnd"/>
-      <w:r>
-        <w:t xml:space="preserve">, </w:t>
-      </w:r>
-      <w:proofErr w:type="spellStart"/>
-      <w:r>
-        <w:t>ecf</w:t>
-      </w:r>
-      <w:proofErr w:type="spellEnd"/>
-      <w:r>
-        <w:t xml:space="preserve">, </w:t>
-      </w:r>
-      <w:proofErr w:type="spellStart"/>
-      <w:r>
-        <w:t>şıf</w:t>
-      </w:r>
-      <w:proofErr w:type="spellEnd"/>
-      <w:r>
-        <w:t xml:space="preserve">, </w:t>
-      </w:r>
-      <w:proofErr w:type="spellStart"/>
-      <w:r>
-        <w:t>afr</w:t>
-      </w:r>
-      <w:proofErr w:type="spellEnd"/>
-      <w:r>
-        <w:t xml:space="preserve">) ve aralarındaki mesafeleri (95, 95, 35, 35, 85) doğru bir şekilde tespit etmiştir. Bu mesafelerin bölenleri analiz edildiğinde, </w:t>
+        <w:t xml:space="preserve">Son adımda, Adım 1'de elde edilen şifreli metin, anahtarı bilinmiyormuş gibi "Anahtar Uzunluğu" sekmesine girilmiştir. Maksimum anahtar uzunluğu 15 olarak ayarlanmıştır. Algoritma, metindeki tekrarlayan dizileri (fnz, şğh, ecf, şıf, afr) ve aralarındaki mesafeleri (95, 95, 35, 35, 85) doğru bir şekilde tespit etmiştir. Bu mesafelerin bölenleri analiz edildiğinde, </w:t>
       </w:r>
       <w:r>
         <w:rPr>
@@ -2280,11 +1705,14 @@
         <w:rPr>
           <w:noProof/>
         </w:rPr>
+        <w:t xml:space="preserve"> </w:t>
+      </w:r>
+      <w:r>
         <w:drawing>
-          <wp:inline distT="0" distB="0" distL="0" distR="0" wp14:anchorId="3C542058" wp14:editId="351C0CD9">
-            <wp:extent cx="5760720" cy="2907665"/>
-            <wp:effectExtent l="0" t="0" r="0" b="6985"/>
-            <wp:docPr id="2094149647" name="Resim 4" descr="metin, ekran görüntüsü, yazılım, multimedya yazılımı içeren bir resim&#10;&#10;Yapay zeka tarafından oluşturulmuş içerik yanlış olabilir."/>
+          <wp:inline distT="0" distB="0" distL="0" distR="0" wp14:anchorId="65598DCC" wp14:editId="5C78AF13">
+            <wp:extent cx="5760720" cy="2870835"/>
+            <wp:effectExtent l="0" t="0" r="0" b="5715"/>
+            <wp:docPr id="382206309" name="Resim 1"/>
             <wp:cNvGraphicFramePr>
               <a:graphicFrameLocks xmlns:a="http://schemas.openxmlformats.org/drawingml/2006/main" noChangeAspect="1"/>
             </wp:cNvGraphicFramePr>
@@ -2292,17 +1720,11 @@
               <a:graphicData uri="http://schemas.openxmlformats.org/drawingml/2006/picture">
                 <pic:pic xmlns:pic="http://schemas.openxmlformats.org/drawingml/2006/picture">
                   <pic:nvPicPr>
-                    <pic:cNvPr id="2094149647" name="Resim 4" descr="metin, ekran görüntüsü, yazılım, multimedya yazılımı içeren bir resim&#10;&#10;Yapay zeka tarafından oluşturulmuş içerik yanlış olabilir."/>
+                    <pic:cNvPr id="382206309" name=""/>
                     <pic:cNvPicPr/>
                   </pic:nvPicPr>
                   <pic:blipFill>
-                    <a:blip r:embed="rId12" cstate="print">
-                      <a:extLst>
-                        <a:ext uri="{28A0092B-C50C-407E-A947-70E740481C1C}">
-                          <a14:useLocalDpi xmlns:a14="http://schemas.microsoft.com/office/drawing/2010/main" val="0"/>
-                        </a:ext>
-                      </a:extLst>
-                    </a:blip>
+                    <a:blip r:embed="rId12"/>
                     <a:stretch>
                       <a:fillRect/>
                     </a:stretch>
@@ -2310,7 +1732,7 @@
                   <pic:spPr>
                     <a:xfrm>
                       <a:off x="0" y="0"/>
-                      <a:ext cx="5760720" cy="2907665"/>
+                      <a:ext cx="5760720" cy="2870835"/>
                     </a:xfrm>
                     <a:prstGeom prst="rect">
                       <a:avLst/>
@@ -2346,23 +1768,7 @@
           <w:b/>
           <w:bCs/>
         </w:rPr>
-        <w:t xml:space="preserve">: </w:t>
-      </w:r>
-      <w:proofErr w:type="spellStart"/>
-      <w:r>
-        <w:rPr>
-          <w:b/>
-          <w:bCs/>
-        </w:rPr>
-        <w:t>Kasiski</w:t>
-      </w:r>
-      <w:proofErr w:type="spellEnd"/>
-      <w:r>
-        <w:rPr>
-          <w:b/>
-          <w:bCs/>
-        </w:rPr>
-        <w:t xml:space="preserve"> Testi sonucunda, doğru anahtar uzunluğunun (5) başarıyla tahmin edilmesi.</w:t>
+        <w:t>: Kasiski Testi sonucunda, doğru anahtar uzunluğunun (5) başarıyla tahmin edilmesi.</w:t>
       </w:r>
     </w:p>
     <w:p/>
@@ -2384,23 +1790,7 @@
     </w:p>
     <w:p>
       <w:r>
-        <w:t xml:space="preserve">Geliştirilen bu yeni modül, </w:t>
-      </w:r>
-      <w:proofErr w:type="spellStart"/>
-      <w:r>
-        <w:t>Vigenere</w:t>
-      </w:r>
-      <w:proofErr w:type="spellEnd"/>
-      <w:r>
-        <w:t xml:space="preserve"> Şifreleme algoritmasını ve ödevde talep edilen </w:t>
-      </w:r>
-      <w:proofErr w:type="spellStart"/>
-      <w:r>
-        <w:t>Kasiski</w:t>
-      </w:r>
-      <w:proofErr w:type="spellEnd"/>
-      <w:r>
-        <w:t xml:space="preserve"> testini başarıyla uygulamaktadır. </w:t>
+        <w:t xml:space="preserve">Geliştirilen bu yeni modül, Vigenere Şifreleme algoritmasını ve ödevde talep edilen Kasiski testini başarıyla uygulamaktadır. </w:t>
       </w:r>
       <w:proofErr w:type="gramStart"/>
       <w:r>
@@ -2421,23 +1811,7 @@
     </w:p>
     <w:p>
       <w:r>
-        <w:t xml:space="preserve">Özellikle </w:t>
-      </w:r>
-      <w:proofErr w:type="spellStart"/>
-      <w:r>
-        <w:t>Kasiski</w:t>
-      </w:r>
-      <w:proofErr w:type="spellEnd"/>
-      <w:r>
-        <w:t xml:space="preserve"> testinin implementasyonu, tekrarlayan dizi bulma, mesafe hesaplama ve bölen analizi gibi adımları içererek, kriptanaliz tekniklerinin pratik olarak nasıl uygulanabileceği konusunda önemli bir öğrenme deneyimi sağlamıştır. Projenin modüler yapısı, farklı kriptografik algoritmaların tek bir platform altında toplanabilmesi açısından avantajını bir kez daha göstermiştir. Bu ödev, </w:t>
-      </w:r>
-      <w:proofErr w:type="spellStart"/>
-      <w:r>
-        <w:t>polialfabetik</w:t>
-      </w:r>
-      <w:proofErr w:type="spellEnd"/>
-      <w:r>
-        <w:t xml:space="preserve"> şifreleme ve temel kriptanaliz yöntemleri konularındaki bilgiyi pekiştirmiştir.</w:t>
+        <w:t>Özellikle Kasiski testinin implementasyonu, tekrarlayan dizi bulma, mesafe hesaplama ve bölen analizi gibi adımları içererek, kriptanaliz tekniklerinin pratik olarak nasıl uygulanabileceği konusunda önemli bir öğrenme deneyimi sağlamıştır. Projenin modüler yapısı, farklı kriptografik algoritmaların tek bir platform altında toplanabilmesi açısından avantajını bir kez daha göstermiştir. Bu ödev, polialfabetik şifreleme ve temel kriptanaliz yöntemleri konularındaki bilgiyi pekiştirmiştir.</w:t>
       </w:r>
     </w:p>
     <w:p/>
@@ -4273,6 +3647,7 @@
   <w:style w:type="character" w:default="1" w:styleId="VarsaylanParagrafYazTipi">
     <w:name w:val="Default Paragraph Font"/>
     <w:uiPriority w:val="1"/>
+    <w:semiHidden/>
     <w:unhideWhenUsed/>
   </w:style>
   <w:style w:type="table" w:default="1" w:styleId="NormalTablo">

</xml_diff>